<commit_message>
Deploying to gh-pages from @ Morrison-Lab/cds@17ef8f285875186ff2550ea5ac8f6ede1d750bbe 🚀
</commit_message>
<xml_diff>
--- a/index.docx
+++ b/index.docx
@@ -7,7 +7,7 @@
         <w:pStyle w:val="Title"/>
       </w:pPr>
       <w:r>
-        <w:t xml:space="preserve">Quarto Website Template</w:t>
+        <w:t xml:space="preserve">Computational Complexity for Data Science</w:t>
       </w:r>
     </w:p>
     <w:p>
@@ -15,13 +15,13 @@
         <w:pStyle w:val="Date"/>
       </w:pPr>
       <w:r>
-        <w:t xml:space="preserve">Last modified: 2026-10-12 00:42:48 (PDT)</w:t>
-      </w:r>
-    </w:p>
-    <w:bookmarkStart w:id="17" w:name="welcome"/>
-    <w:p>
-      <w:pPr>
-        <w:pStyle w:val="Heading1"/>
+        <w:t xml:space="preserve">Last modified: 2026-10-12 01:05:40 (PDT)</w:t>
+      </w:r>
+    </w:p>
+    <w:bookmarkStart w:id="10" w:name="welcome"/>
+    <w:p>
+      <w:pPr>
+        <w:pStyle w:val="Heading2"/>
       </w:pPr>
       <w:r>
         <w:t xml:space="preserve">Welcome</w:t>
@@ -32,7 +32,31 @@
         <w:pStyle w:val="FirstParagraph"/>
       </w:pPr>
       <w:r>
-        <w:t xml:space="preserve">This is a Quarto website template that you can use to create your own website.</w:t>
+        <w:t xml:space="preserve">Computational complexity asks how much time, memory or randomness</w:t>
+      </w:r>
+      <w:r>
+        <w:t xml:space="preserve"> </w:t>
+      </w:r>
+      <w:r>
+        <w:t xml:space="preserve">a problem needs, whatever algorithm solves it.</w:t>
+      </w:r>
+      <w:r>
+        <w:t xml:space="preserve"> </w:t>
+      </w:r>
+      <w:r>
+        <w:t xml:space="preserve">Data science meets it whenever fitting a model exactly turns out to be</w:t>
+      </w:r>
+      <w:r>
+        <w:t xml:space="preserve"> </w:t>
+      </w:r>
+      <w:r>
+        <w:t xml:space="preserve">computationally hard,</w:t>
+      </w:r>
+      <w:r>
+        <w:t xml:space="preserve"> </w:t>
+      </w:r>
+      <w:r>
+        <w:t xml:space="preserve">which is one reason practical methods use greedy search or a convex surrogate loss.</w:t>
       </w:r>
     </w:p>
     <w:p>
@@ -40,7 +64,19 @@
         <w:pStyle w:val="BodyText"/>
       </w:pPr>
       <w:r>
-        <w:t xml:space="preserve">The notes are available in multiple formats:</w:t>
+        <w:t xml:space="preserve">These notes collect the computational complexity that data science courses use.</w:t>
+      </w:r>
+      <w:r>
+        <w:t xml:space="preserve"> </w:t>
+      </w:r>
+      <w:r>
+        <w:t xml:space="preserve">They are new, and the topic pages are still to be written.</w:t>
+      </w:r>
+      <w:r>
+        <w:t xml:space="preserve"> </w:t>
+      </w:r>
+      <w:r>
+        <w:t xml:space="preserve">The planned topics are:</w:t>
       </w:r>
     </w:p>
     <w:p>
@@ -52,14 +88,7 @@
         </w:numPr>
       </w:pPr>
       <w:r>
-        <w:rPr>
-          <w:b/>
-          <w:bCs/>
-        </w:rPr>
-        <w:t xml:space="preserve">HTML Website</w:t>
-      </w:r>
-      <w:r>
-        <w:t xml:space="preserve">: Navigate using the navbar for easy access to all pages</w:t>
+        <w:t xml:space="preserve">models of computation: Turing machines and computability</w:t>
       </w:r>
     </w:p>
     <w:p>
@@ -71,29 +100,7 @@
         </w:numPr>
       </w:pPr>
       <w:r>
-        <w:rPr>
-          <w:b/>
-          <w:bCs/>
-        </w:rPr>
-        <w:t xml:space="preserve">RevealJS Slides</w:t>
-      </w:r>
-      <w:r>
-        <w:t xml:space="preserve">: Each chapter can generate a presentation format with</w:t>
-      </w:r>
-      <w:r>
-        <w:t xml:space="preserve"> </w:t>
-      </w:r>
-      <w:r>
-        <w:rPr>
-          <w:rStyle w:val="VerbatimChar"/>
-        </w:rPr>
-        <w:t xml:space="preserve">-slides.html</w:t>
-      </w:r>
-      <w:r>
-        <w:t xml:space="preserve"> </w:t>
-      </w:r>
-      <w:r>
-        <w:t xml:space="preserve">suffix</w:t>
+        <w:t xml:space="preserve">time and space complexity, and the classes P and NP</w:t>
       </w:r>
     </w:p>
     <w:p>
@@ -105,29 +112,7 @@
         </w:numPr>
       </w:pPr>
       <w:r>
-        <w:rPr>
-          <w:b/>
-          <w:bCs/>
-        </w:rPr>
-        <w:t xml:space="preserve">PDF Handouts</w:t>
-      </w:r>
-      <w:r>
-        <w:t xml:space="preserve">: Each chapter can generate a PDF handout with</w:t>
-      </w:r>
-      <w:r>
-        <w:t xml:space="preserve"> </w:t>
-      </w:r>
-      <w:r>
-        <w:rPr>
-          <w:rStyle w:val="VerbatimChar"/>
-        </w:rPr>
-        <w:t xml:space="preserve">-handout.pdf</w:t>
-      </w:r>
-      <w:r>
-        <w:t xml:space="preserve"> </w:t>
-      </w:r>
-      <w:r>
-        <w:t xml:space="preserve">suffix</w:t>
+        <w:t xml:space="preserve">reductions and NP-completeness</w:t>
       </w:r>
     </w:p>
     <w:p>
@@ -139,38 +124,19 @@
         </w:numPr>
       </w:pPr>
       <w:r>
-        <w:rPr>
-          <w:b/>
-          <w:bCs/>
-        </w:rPr>
-        <w:t xml:space="preserve">DOCX Documents</w:t>
-      </w:r>
-      <w:r>
-        <w:t xml:space="preserve">: Each chapter can generate a Microsoft Word document with</w:t>
-      </w:r>
-      <w:r>
-        <w:t xml:space="preserve"> </w:t>
-      </w:r>
-      <w:r>
-        <w:rPr>
-          <w:rStyle w:val="VerbatimChar"/>
-        </w:rPr>
-        <w:t xml:space="preserve">.docx</w:t>
-      </w:r>
-      <w:r>
-        <w:t xml:space="preserve"> </w:t>
-      </w:r>
-      <w:r>
-        <w:t xml:space="preserve">extension</w:t>
-      </w:r>
-    </w:p>
-    <w:bookmarkStart w:id="10" w:name="about-this-website"/>
-    <w:p>
-      <w:pPr>
-        <w:pStyle w:val="Heading2"/>
-      </w:pPr>
-      <w:r>
-        <w:t xml:space="preserve">0.1 About this website</w:t>
+        <w:t xml:space="preserve">randomized computation</w:t>
+      </w:r>
+    </w:p>
+    <w:p>
+      <w:pPr>
+        <w:pStyle w:val="Compact"/>
+        <w:numPr>
+          <w:ilvl w:val="0"/>
+          <w:numId w:val="1001"/>
+        </w:numPr>
+      </w:pPr>
+      <w:r>
+        <w:t xml:space="preserve">communication and information complexity</w:t>
       </w:r>
     </w:p>
     <w:p>
@@ -178,7 +144,7 @@
         <w:pStyle w:val="FirstParagraph"/>
       </w:pPr>
       <w:r>
-        <w:t xml:space="preserve">This website is built with</w:t>
+        <w:t xml:space="preserve">Information theory has its own library,</w:t>
       </w:r>
       <w:r>
         <w:t xml:space="preserve"> </w:t>
@@ -187,22 +153,36 @@
         <w:r>
           <w:rPr>
             <w:rStyle w:val="Hyperlink"/>
+            <w:i/>
+            <w:iCs/>
           </w:rPr>
-          <w:t xml:space="preserve">Quarto</w:t>
+          <w:t xml:space="preserve">Information Theory for Data Science</w:t>
         </w:r>
       </w:hyperlink>
       <w:r>
-        <w:t xml:space="preserve">, an open-source scientific and technical publishing system. You can use Quarto to create books, websites, blogs, presentations, and more from markdown files.</w:t>
+        <w:t xml:space="preserve">.</w:t>
+      </w:r>
+      <w:r>
+        <w:t xml:space="preserve"> </w:t>
+      </w:r>
+      <w:r>
+        <w:t xml:space="preserve">Results that connect the two live in the library that holds</w:t>
+      </w:r>
+      <w:r>
+        <w:t xml:space="preserve"> </w:t>
+      </w:r>
+      <w:r>
+        <w:t xml:space="preserve">their main statement, and the other links to them.</w:t>
       </w:r>
     </w:p>
     <w:bookmarkEnd w:id="10"/>
-    <w:bookmarkStart w:id="11" w:name="getting-started"/>
+    <w:bookmarkStart w:id="15" w:name="starting-materials"/>
     <w:p>
       <w:pPr>
         <w:pStyle w:val="Heading2"/>
       </w:pPr>
       <w:r>
-        <w:t xml:space="preserve">0.2 Getting Started</w:t>
+        <w:t xml:space="preserve">Starting materials</w:t>
       </w:r>
     </w:p>
     <w:p>
@@ -210,139 +190,233 @@
         <w:pStyle w:val="FirstParagraph"/>
       </w:pPr>
       <w:r>
-        <w:t xml:space="preserve">To use this template:</w:t>
-      </w:r>
-    </w:p>
-    <w:p>
-      <w:pPr>
+        <w:t xml:space="preserve">These notes are written fresh, but they draw on the following books and Stanford course pages.</w:t>
+      </w:r>
+    </w:p>
+    <w:p>
+      <w:pPr>
+        <w:pStyle w:val="Compact"/>
         <w:numPr>
           <w:ilvl w:val="0"/>
           <w:numId w:val="1002"/>
         </w:numPr>
       </w:pPr>
       <w:r>
+        <w:t xml:space="preserve">Sanjeev Arora and Boaz Barak,</w:t>
+      </w:r>
+      <w:r>
+        <w:t xml:space="preserve"> </w:t>
+      </w:r>
+      <w:r>
         <w:rPr>
-          <w:b/>
-          <w:bCs/>
+          <w:i/>
+          <w:iCs/>
         </w:rPr>
-        <w:t xml:space="preserve">Update the configuration</w:t>
-      </w:r>
-      <w:r>
-        <w:t xml:space="preserve">: Edit</w:t>
-      </w:r>
-      <w:r>
-        <w:t xml:space="preserve"> </w:t>
-      </w:r>
-      <w:r>
-        <w:rPr>
-          <w:rStyle w:val="VerbatimChar"/>
-        </w:rPr>
-        <w:t xml:space="preserve">_quarto-website.yml</w:t>
-      </w:r>
-      <w:r>
-        <w:t xml:space="preserve"> </w:t>
-      </w:r>
-      <w:r>
-        <w:t xml:space="preserve">to change the website title, site URL, and navigation menu.</w:t>
-      </w:r>
-    </w:p>
-    <w:p>
-      <w:pPr>
+        <w:t xml:space="preserve">Computational Complexity: A Modern Approach</w:t>
+      </w:r>
+      <w:r>
+        <w:t xml:space="preserve">,</w:t>
+      </w:r>
+      <w:r>
+        <w:t xml:space="preserve"> </w:t>
+      </w:r>
+      <w:r>
+        <w:t xml:space="preserve">the main starting point for complexity theory.</w:t>
+      </w:r>
+    </w:p>
+    <w:p>
+      <w:pPr>
+        <w:pStyle w:val="Compact"/>
         <w:numPr>
           <w:ilvl w:val="0"/>
           <w:numId w:val="1002"/>
         </w:numPr>
       </w:pPr>
+      <w:hyperlink r:id="rId11">
+        <w:r>
+          <w:rPr>
+            <w:rStyle w:val="Hyperlink"/>
+          </w:rPr>
+          <w:t xml:space="preserve">CS154: Introduction to the Theory of Computation</w:t>
+        </w:r>
+      </w:hyperlink>
+      <w:r>
+        <w:t xml:space="preserve"> </w:t>
+      </w:r>
+      <w:r>
+        <w:t xml:space="preserve">(Omer Reingold and Li-Yang Tan), which covers automata, computability and complexity,</w:t>
+      </w:r>
+      <w:r>
+        <w:t xml:space="preserve"> </w:t>
+      </w:r>
+      <w:r>
+        <w:t xml:space="preserve">using Michael Sipser’s</w:t>
+      </w:r>
+      <w:r>
+        <w:t xml:space="preserve"> </w:t>
+      </w:r>
       <w:r>
         <w:rPr>
-          <w:b/>
-          <w:bCs/>
+          <w:i/>
+          <w:iCs/>
         </w:rPr>
-        <w:t xml:space="preserve">Add your content</w:t>
-      </w:r>
-      <w:r>
-        <w:t xml:space="preserve">: Create new</w:t>
-      </w:r>
-      <w:r>
-        <w:t xml:space="preserve"> </w:t>
-      </w:r>
-      <w:r>
-        <w:rPr>
-          <w:rStyle w:val="VerbatimChar"/>
-        </w:rPr>
-        <w:t xml:space="preserve">.qmd</w:t>
-      </w:r>
-      <w:r>
-        <w:t xml:space="preserve"> </w:t>
-      </w:r>
-      <w:r>
-        <w:t xml:space="preserve">files for each page and add them to the navigation menu and the sidebar in</w:t>
-      </w:r>
-      <w:r>
-        <w:t xml:space="preserve"> </w:t>
-      </w:r>
-      <w:r>
-        <w:rPr>
-          <w:rStyle w:val="VerbatimChar"/>
-        </w:rPr>
-        <w:t xml:space="preserve">_quarto-website.yml</w:t>
-      </w:r>
-      <w:r>
-        <w:t xml:space="preserve"> </w:t>
-      </w:r>
-      <w:r>
-        <w:t xml:space="preserve">(the sidebar order sets the previous/next page links).</w:t>
-      </w:r>
-    </w:p>
-    <w:p>
-      <w:pPr>
+        <w:t xml:space="preserve">Introduction to the Theory of Computation</w:t>
+      </w:r>
+      <w:r>
+        <w:t xml:space="preserve">,</w:t>
+      </w:r>
+      <w:r>
+        <w:t xml:space="preserve"> </w:t>
+      </w:r>
+      <w:r>
+        <w:t xml:space="preserve">with lecture slides and videos.</w:t>
+      </w:r>
+    </w:p>
+    <w:p>
+      <w:pPr>
+        <w:pStyle w:val="Compact"/>
         <w:numPr>
           <w:ilvl w:val="0"/>
           <w:numId w:val="1002"/>
         </w:numPr>
       </w:pPr>
-      <w:r>
-        <w:rPr>
-          <w:b/>
-          <w:bCs/>
-        </w:rPr>
-        <w:t xml:space="preserve">Customize the style</w:t>
-      </w:r>
-      <w:r>
-        <w:t xml:space="preserve">: Modify</w:t>
-      </w:r>
-      <w:r>
-        <w:t xml:space="preserve"> </w:t>
-      </w:r>
-      <w:r>
-        <w:rPr>
-          <w:rStyle w:val="VerbatimChar"/>
-        </w:rPr>
-        <w:t xml:space="preserve">styles.css</w:t>
-      </w:r>
-      <w:r>
-        <w:t xml:space="preserve"> </w:t>
-      </w:r>
-      <w:r>
-        <w:t xml:space="preserve">to change the appearance of your website.</w:t>
-      </w:r>
-    </w:p>
-    <w:p>
-      <w:pPr>
+      <w:hyperlink r:id="rId12">
+        <w:r>
+          <w:rPr>
+            <w:rStyle w:val="Hyperlink"/>
+          </w:rPr>
+          <w:t xml:space="preserve">CS154: Introduction to Automata and Complexity Theory</w:t>
+        </w:r>
+      </w:hyperlink>
+      <w:r>
+        <w:t xml:space="preserve"> </w:t>
+      </w:r>
+      <w:r>
+        <w:t xml:space="preserve">(Spring 2009, with Rajeev Motwani among the course staff),</w:t>
+      </w:r>
+      <w:r>
+        <w:t xml:space="preserve"> </w:t>
+      </w:r>
+      <w:r>
+        <w:t xml:space="preserve">with handouts, homework and a reading list.</w:t>
+      </w:r>
+    </w:p>
+    <w:p>
+      <w:pPr>
+        <w:pStyle w:val="Compact"/>
         <w:numPr>
           <w:ilvl w:val="0"/>
           <w:numId w:val="1002"/>
         </w:numPr>
       </w:pPr>
+      <w:hyperlink r:id="rId13">
+        <w:r>
+          <w:rPr>
+            <w:rStyle w:val="Hyperlink"/>
+            <w:i/>
+            <w:iCs/>
+          </w:rPr>
+          <w:t xml:space="preserve">Introduction to Automata Theory, Languages, and Computation</w:t>
+        </w:r>
+      </w:hyperlink>
+      <w:r>
+        <w:t xml:space="preserve">,</w:t>
+      </w:r>
+      <w:r>
+        <w:t xml:space="preserve"> </w:t>
+      </w:r>
+      <w:r>
+        <w:t xml:space="preserve">Jeff Ullman’s home page for the book, which is the textbook the 2009 CS154 page links.</w:t>
+      </w:r>
+      <w:r>
+        <w:t xml:space="preserve"> </w:t>
+      </w:r>
+      <w:r>
+        <w:t xml:space="preserve">It has solutions to starred exercises, errata, slides, and past CS154 course materials.</w:t>
+      </w:r>
+    </w:p>
+    <w:p>
+      <w:pPr>
+        <w:pStyle w:val="Compact"/>
+        <w:numPr>
+          <w:ilvl w:val="0"/>
+          <w:numId w:val="1002"/>
+        </w:numPr>
+      </w:pPr>
+      <w:hyperlink r:id="rId14">
+        <w:r>
+          <w:rPr>
+            <w:rStyle w:val="Hyperlink"/>
+          </w:rPr>
+          <w:t xml:space="preserve">CS254: Computational Complexity</w:t>
+        </w:r>
+      </w:hyperlink>
+      <w:r>
+        <w:t xml:space="preserve"> </w:t>
+      </w:r>
+      <w:r>
+        <w:t xml:space="preserve">(Li-Yang Tan), which covers space complexity, the polynomial hierarchy, randomized and non-uniform computation,</w:t>
+      </w:r>
+      <w:r>
+        <w:t xml:space="preserve"> </w:t>
+      </w:r>
+      <w:r>
+        <w:t xml:space="preserve">and interactive proofs.</w:t>
+      </w:r>
+      <w:r>
+        <w:t xml:space="preserve"> </w:t>
+      </w:r>
+      <w:r>
+        <w:t xml:space="preserve">It uses Arora and Barak and Avi Wigderson’s</w:t>
+      </w:r>
+      <w:r>
+        <w:t xml:space="preserve"> </w:t>
+      </w:r>
       <w:r>
         <w:rPr>
-          <w:b/>
-          <w:bCs/>
+          <w:i/>
+          <w:iCs/>
         </w:rPr>
-        <w:t xml:space="preserve">Add references</w:t>
-      </w:r>
-      <w:r>
-        <w:t xml:space="preserve">: Update</w:t>
+        <w:t xml:space="preserve">Mathematics and Computation</w:t>
+      </w:r>
+      <w:r>
+        <w:t xml:space="preserve">,</w:t>
+      </w:r>
+      <w:r>
+        <w:t xml:space="preserve"> </w:t>
+      </w:r>
+      <w:r>
+        <w:t xml:space="preserve">and links a reading for each lecture.</w:t>
+      </w:r>
+    </w:p>
+    <w:bookmarkEnd w:id="15"/>
+    <w:bookmarkStart w:id="16" w:name="using-these-notes-in-another-site"/>
+    <w:p>
+      <w:pPr>
+        <w:pStyle w:val="Heading2"/>
+      </w:pPr>
+      <w:r>
+        <w:t xml:space="preserve">Using these notes in another site</w:t>
+      </w:r>
+    </w:p>
+    <w:p>
+      <w:pPr>
+        <w:pStyle w:val="FirstParagraph"/>
+      </w:pPr>
+      <w:r>
+        <w:t xml:space="preserve">Course sites link to these pages by URL;</w:t>
+      </w:r>
+      <w:r>
+        <w:t xml:space="preserve"> </w:t>
+      </w:r>
+      <w:r>
+        <w:t xml:space="preserve">they do not include this repository as a git submodule.</w:t>
+      </w:r>
+      <w:r>
+        <w:t xml:space="preserve"> </w:t>
+      </w:r>
+      <w:r>
+        <w:t xml:space="preserve">A host site that keeps a copy of this repository at its root, named</w:t>
       </w:r>
       <w:r>
         <w:t xml:space="preserve"> </w:t>
@@ -351,81 +425,16 @@
         <w:rPr>
           <w:rStyle w:val="VerbatimChar"/>
         </w:rPr>
-        <w:t xml:space="preserve">references.bib</w:t>
-      </w:r>
-      <w:r>
-        <w:t xml:space="preserve"> </w:t>
-      </w:r>
-      <w:r>
-        <w:t xml:space="preserve">with your citations.</w:t>
-      </w:r>
-    </w:p>
-    <w:bookmarkEnd w:id="11"/>
-    <w:bookmarkStart w:id="12" w:name="building-the-website"/>
-    <w:p>
-      <w:pPr>
-        <w:pStyle w:val="Heading2"/>
-      </w:pPr>
-      <w:r>
-        <w:t xml:space="preserve">0.3 Building the website</w:t>
-      </w:r>
-    </w:p>
-    <w:p>
-      <w:pPr>
-        <w:pStyle w:val="FirstParagraph"/>
-      </w:pPr>
-      <w:r>
-        <w:t xml:space="preserve">To render the website locally:</w:t>
-      </w:r>
-    </w:p>
-    <w:p>
-      <w:pPr>
-        <w:pStyle w:val="SourceCode"/>
-      </w:pPr>
-      <w:r>
-        <w:rPr>
-          <w:rStyle w:val="ExtensionTok"/>
-        </w:rPr>
-        <w:t xml:space="preserve">quarto</w:t>
-      </w:r>
-      <w:r>
-        <w:rPr>
-          <w:rStyle w:val="NormalTok"/>
-        </w:rPr>
-        <w:t xml:space="preserve"> render</w:t>
-      </w:r>
-    </w:p>
-    <w:p>
-      <w:pPr>
-        <w:pStyle w:val="FirstParagraph"/>
-      </w:pPr>
-      <w:r>
-        <w:t xml:space="preserve">To preview the website with live reload:</w:t>
-      </w:r>
-    </w:p>
-    <w:p>
-      <w:pPr>
-        <w:pStyle w:val="SourceCode"/>
-      </w:pPr>
-      <w:r>
-        <w:rPr>
-          <w:rStyle w:val="ExtensionTok"/>
-        </w:rPr>
-        <w:t xml:space="preserve">quarto</w:t>
-      </w:r>
-      <w:r>
-        <w:rPr>
-          <w:rStyle w:val="NormalTok"/>
-        </w:rPr>
-        <w:t xml:space="preserve"> preview</w:t>
-      </w:r>
-    </w:p>
-    <w:p>
-      <w:pPr>
-        <w:pStyle w:val="FirstParagraph"/>
-      </w:pPr>
-      <w:r>
-        <w:t xml:space="preserve">The rendered output will be in the</w:t>
+        <w:t xml:space="preserve">cds</w:t>
+      </w:r>
+      <w:r>
+        <w:t xml:space="preserve">,</w:t>
+      </w:r>
+      <w:r>
+        <w:t xml:space="preserve"> </w:t>
+      </w:r>
+      <w:r>
+        <w:t xml:space="preserve">can still include fragments with paths that start with</w:t>
       </w:r>
       <w:r>
         <w:t xml:space="preserve"> </w:t>
@@ -434,134 +443,22 @@
         <w:rPr>
           <w:rStyle w:val="VerbatimChar"/>
         </w:rPr>
-        <w:t xml:space="preserve">_site/</w:t>
-      </w:r>
-      <w:r>
-        <w:t xml:space="preserve"> </w:t>
-      </w:r>
-      <w:r>
-        <w:t xml:space="preserve">directory, which can be published to GitHub Pages.</w:t>
-      </w:r>
-    </w:p>
-    <w:bookmarkEnd w:id="12"/>
-    <w:bookmarkStart w:id="13" w:name="publishing-to-github-pages"/>
-    <w:p>
-      <w:pPr>
-        <w:pStyle w:val="Heading2"/>
-      </w:pPr>
-      <w:r>
-        <w:t xml:space="preserve">0.4 Publishing to GitHub Pages</w:t>
-      </w:r>
-    </w:p>
-    <w:p>
-      <w:pPr>
-        <w:pStyle w:val="FirstParagraph"/>
-      </w:pPr>
-      <w:r>
-        <w:t xml:space="preserve">This template includes a GitHub Actions workflow that automatically builds and publishes your website to GitHub Pages when you push to the main branch.</w:t>
-      </w:r>
-    </w:p>
-    <w:p>
-      <w:pPr>
-        <w:pStyle w:val="BodyText"/>
-      </w:pPr>
-      <w:r>
-        <w:t xml:space="preserve">To enable GitHub Pages:</w:t>
-      </w:r>
-    </w:p>
-    <w:p>
-      <w:pPr>
-        <w:pStyle w:val="Compact"/>
-        <w:numPr>
-          <w:ilvl w:val="0"/>
-          <w:numId w:val="1003"/>
-        </w:numPr>
-      </w:pPr>
-      <w:r>
-        <w:t xml:space="preserve">Go to your repository settings</w:t>
-      </w:r>
-    </w:p>
-    <w:p>
-      <w:pPr>
-        <w:pStyle w:val="Compact"/>
-        <w:numPr>
-          <w:ilvl w:val="0"/>
-          <w:numId w:val="1003"/>
-        </w:numPr>
-      </w:pPr>
-      <w:r>
-        <w:t xml:space="preserve">Navigate to</w:t>
-      </w:r>
-      <w:r>
-        <w:t xml:space="preserve"> </w:t>
-      </w:r>
-      <w:r>
-        <w:t xml:space="preserve">“Pages”</w:t>
-      </w:r>
-      <w:r>
-        <w:t xml:space="preserve"> </w:t>
-      </w:r>
-      <w:r>
-        <w:t xml:space="preserve">in the left sidebar</w:t>
-      </w:r>
-    </w:p>
-    <w:p>
-      <w:pPr>
-        <w:pStyle w:val="Compact"/>
-        <w:numPr>
-          <w:ilvl w:val="0"/>
-          <w:numId w:val="1003"/>
-        </w:numPr>
-      </w:pPr>
-      <w:r>
-        <w:t xml:space="preserve">Under</w:t>
-      </w:r>
-      <w:r>
-        <w:t xml:space="preserve"> </w:t>
-      </w:r>
-      <w:r>
-        <w:t xml:space="preserve">“Build and deployment”</w:t>
-      </w:r>
-      <w:r>
-        <w:t xml:space="preserve">, set Source to</w:t>
-      </w:r>
-      <w:r>
-        <w:t xml:space="preserve"> </w:t>
-      </w:r>
-      <w:r>
-        <w:t xml:space="preserve">“GitHub Actions”</w:t>
-      </w:r>
-    </w:p>
-    <w:p>
-      <w:pPr>
-        <w:pStyle w:val="Compact"/>
-        <w:numPr>
-          <w:ilvl w:val="0"/>
-          <w:numId w:val="1003"/>
-        </w:numPr>
-      </w:pPr>
-      <w:r>
-        <w:t xml:space="preserve">Push your changes to the main branch</w:t>
-      </w:r>
-    </w:p>
-    <w:p>
-      <w:pPr>
-        <w:pStyle w:val="Compact"/>
-        <w:numPr>
-          <w:ilvl w:val="0"/>
-          <w:numId w:val="1003"/>
-        </w:numPr>
-      </w:pPr>
-      <w:r>
-        <w:t xml:space="preserve">The workflow will automatically build and deploy your website</w:t>
-      </w:r>
-    </w:p>
-    <w:p>
-      <w:pPr>
-        <w:pStyle w:val="FirstParagraph"/>
-      </w:pPr>
-      <w:r>
-        <w:t xml:space="preserve">Your website will be available at</w:t>
+        <w:t xml:space="preserve">cds/</w:t>
+      </w:r>
+      <w:r>
+        <w:t xml:space="preserve">.</w:t>
+      </w:r>
+      <w:r>
+        <w:t xml:space="preserve"> </w:t>
+      </w:r>
+      <w:r>
+        <w:t xml:space="preserve">This site includes its own fragments the same way,</w:t>
+      </w:r>
+      <w:r>
+        <w:t xml:space="preserve"> </w:t>
+      </w:r>
+      <w:r>
+        <w:t xml:space="preserve">through a</w:t>
       </w:r>
       <w:r>
         <w:t xml:space="preserve"> </w:t>
@@ -570,41 +467,51 @@
         <w:rPr>
           <w:rStyle w:val="VerbatimChar"/>
         </w:rPr>
-        <w:t xml:space="preserve">https://YOUR-USERNAME.github.io/YOUR-REPO/</w:t>
-      </w:r>
-    </w:p>
-    <w:bookmarkEnd w:id="13"/>
-    <w:bookmarkStart w:id="14" w:name="license"/>
-    <w:p>
-      <w:pPr>
-        <w:pStyle w:val="Heading2"/>
-      </w:pPr>
-      <w:r>
-        <w:t xml:space="preserve">0.5 License</w:t>
-      </w:r>
-    </w:p>
-    <w:p>
-      <w:pPr>
-        <w:pStyle w:val="FirstParagraph"/>
-      </w:pPr>
-      <w:r>
-        <w:t xml:space="preserve">Add your license information here.</w:t>
-      </w:r>
-    </w:p>
-    <w:bookmarkEnd w:id="14"/>
-    <w:bookmarkStart w:id="16" w:name="references"/>
-    <w:p>
-      <w:pPr>
-        <w:pStyle w:val="Heading2"/>
-      </w:pPr>
-      <w:r>
-        <w:t xml:space="preserve">References</w:t>
-      </w:r>
-    </w:p>
-    <w:bookmarkStart w:id="15" w:name="refs"/>
-    <w:bookmarkEnd w:id="15"/>
+        <w:t xml:space="preserve">cds</w:t>
+      </w:r>
+      <w:r>
+        <w:t xml:space="preserve"> </w:t>
+      </w:r>
+      <w:r>
+        <w:t xml:space="preserve">symlink that points at the repository root.</w:t>
+      </w:r>
+    </w:p>
+    <w:p>
+      <w:pPr>
+        <w:pStyle w:val="BodyText"/>
+      </w:pPr>
+      <w:r>
+        <w:t xml:space="preserve">Quarto resolves</w:t>
+      </w:r>
+      <w:r>
+        <w:t xml:space="preserve"> </w:t>
+      </w:r>
+      <w:r>
+        <w:rPr>
+          <w:rStyle w:val="VerbatimChar"/>
+        </w:rPr>
+        <w:t xml:space="preserve">@id</w:t>
+      </w:r>
+      <w:r>
+        <w:t xml:space="preserve"> </w:t>
+      </w:r>
+      <w:r>
+        <w:t xml:space="preserve">cross-references only within one rendered page,</w:t>
+      </w:r>
+      <w:r>
+        <w:t xml:space="preserve"> </w:t>
+      </w:r>
+      <w:r>
+        <w:t xml:space="preserve">so a host site that links to a result here</w:t>
+      </w:r>
+      <w:r>
+        <w:t xml:space="preserve"> </w:t>
+      </w:r>
+      <w:r>
+        <w:t xml:space="preserve">uses an explicit link to the page and anchor.</w:t>
+      </w:r>
+    </w:p>
     <w:bookmarkEnd w:id="16"/>
-    <w:bookmarkEnd w:id="17"/>
     <w:sectPr>
       <w:footnotePr>
         <w:numRestart w:val="eachSect"/>
@@ -818,91 +725,6 @@
       </w:rPr>
     </w:lvl>
   </w:abstractNum>
-  <w:abstractNum w:abstractNumId="99411">
-    <w:nsid w:val="00A99411"/>
-    <w:multiLevelType w:val="multilevel"/>
-    <w:lvl w:ilvl="0">
-      <w:start w:val="1"/>
-      <w:numFmt w:val="decimal"/>
-      <w:lvlText w:val="%1."/>
-      <w:lvlJc w:val="left"/>
-      <w:pPr>
-        <w:ind w:left="720" w:hanging="360"/>
-      </w:pPr>
-    </w:lvl>
-    <w:lvl w:ilvl="1">
-      <w:start w:val="1"/>
-      <w:numFmt w:val="decimal"/>
-      <w:lvlText w:val="%2."/>
-      <w:lvlJc w:val="left"/>
-      <w:pPr>
-        <w:ind w:left="1440" w:hanging="360"/>
-      </w:pPr>
-    </w:lvl>
-    <w:lvl w:ilvl="2">
-      <w:start w:val="1"/>
-      <w:numFmt w:val="decimal"/>
-      <w:lvlText w:val="%3."/>
-      <w:lvlJc w:val="left"/>
-      <w:pPr>
-        <w:ind w:left="2160" w:hanging="360"/>
-      </w:pPr>
-    </w:lvl>
-    <w:lvl w:ilvl="3">
-      <w:start w:val="1"/>
-      <w:numFmt w:val="decimal"/>
-      <w:lvlText w:val="%4."/>
-      <w:lvlJc w:val="left"/>
-      <w:pPr>
-        <w:ind w:left="2880" w:hanging="360"/>
-      </w:pPr>
-    </w:lvl>
-    <w:lvl w:ilvl="4">
-      <w:start w:val="1"/>
-      <w:numFmt w:val="decimal"/>
-      <w:lvlText w:val="%5."/>
-      <w:lvlJc w:val="left"/>
-      <w:pPr>
-        <w:ind w:left="3600" w:hanging="360"/>
-      </w:pPr>
-    </w:lvl>
-    <w:lvl w:ilvl="5">
-      <w:start w:val="1"/>
-      <w:numFmt w:val="decimal"/>
-      <w:lvlText w:val="%6."/>
-      <w:lvlJc w:val="left"/>
-      <w:pPr>
-        <w:ind w:left="4320" w:hanging="360"/>
-      </w:pPr>
-    </w:lvl>
-    <w:lvl w:ilvl="6">
-      <w:start w:val="1"/>
-      <w:numFmt w:val="decimal"/>
-      <w:lvlText w:val="%7."/>
-      <w:lvlJc w:val="left"/>
-      <w:pPr>
-        <w:ind w:left="5040" w:hanging="360"/>
-      </w:pPr>
-    </w:lvl>
-    <w:lvl w:ilvl="7">
-      <w:start w:val="1"/>
-      <w:numFmt w:val="decimal"/>
-      <w:lvlText w:val="%8."/>
-      <w:lvlJc w:val="left"/>
-      <w:pPr>
-        <w:ind w:left="5760" w:hanging="360"/>
-      </w:pPr>
-    </w:lvl>
-    <w:lvl w:ilvl="8">
-      <w:start w:val="1"/>
-      <w:numFmt w:val="decimal"/>
-      <w:lvlText w:val="%9."/>
-      <w:lvlJc w:val="left"/>
-      <w:pPr>
-        <w:ind w:left="6480" w:hanging="360"/>
-      </w:pPr>
-    </w:lvl>
-  </w:abstractNum>
   <w:num w:numId="1000">
     <w:abstractNumId w:val="990"/>
   </w:num>
@@ -910,64 +732,7 @@
     <w:abstractNumId w:val="991"/>
   </w:num>
   <w:num w:numId="1002">
-    <w:abstractNumId w:val="99411"/>
-    <w:lvlOverride w:ilvl="0">
-      <w:startOverride w:val="1"/>
-    </w:lvlOverride>
-    <w:lvlOverride w:ilvl="1">
-      <w:startOverride w:val="1"/>
-    </w:lvlOverride>
-    <w:lvlOverride w:ilvl="2">
-      <w:startOverride w:val="1"/>
-    </w:lvlOverride>
-    <w:lvlOverride w:ilvl="3">
-      <w:startOverride w:val="1"/>
-    </w:lvlOverride>
-    <w:lvlOverride w:ilvl="4">
-      <w:startOverride w:val="1"/>
-    </w:lvlOverride>
-    <w:lvlOverride w:ilvl="5">
-      <w:startOverride w:val="1"/>
-    </w:lvlOverride>
-    <w:lvlOverride w:ilvl="6">
-      <w:startOverride w:val="1"/>
-    </w:lvlOverride>
-    <w:lvlOverride w:ilvl="7">
-      <w:startOverride w:val="1"/>
-    </w:lvlOverride>
-    <w:lvlOverride w:ilvl="8">
-      <w:startOverride w:val="1"/>
-    </w:lvlOverride>
-  </w:num>
-  <w:num w:numId="1003">
-    <w:abstractNumId w:val="99411"/>
-    <w:lvlOverride w:ilvl="0">
-      <w:startOverride w:val="1"/>
-    </w:lvlOverride>
-    <w:lvlOverride w:ilvl="1">
-      <w:startOverride w:val="1"/>
-    </w:lvlOverride>
-    <w:lvlOverride w:ilvl="2">
-      <w:startOverride w:val="1"/>
-    </w:lvlOverride>
-    <w:lvlOverride w:ilvl="3">
-      <w:startOverride w:val="1"/>
-    </w:lvlOverride>
-    <w:lvlOverride w:ilvl="4">
-      <w:startOverride w:val="1"/>
-    </w:lvlOverride>
-    <w:lvlOverride w:ilvl="5">
-      <w:startOverride w:val="1"/>
-    </w:lvlOverride>
-    <w:lvlOverride w:ilvl="6">
-      <w:startOverride w:val="1"/>
-    </w:lvlOverride>
-    <w:lvlOverride w:ilvl="7">
-      <w:startOverride w:val="1"/>
-    </w:lvlOverride>
-    <w:lvlOverride w:ilvl="8">
-      <w:startOverride w:val="1"/>
-    </w:lvlOverride>
+    <w:abstractNumId w:val="991"/>
   </w:num>
 </w:numbering>
 </file>

</xml_diff>

<commit_message>
Deploying to gh-pages from @ Morrison-Lab/cds@7a3add45cc01f7a5daea0806ed43ee0fef902f5c 🚀
</commit_message>
<xml_diff>
--- a/index.docx
+++ b/index.docx
@@ -15,10 +15,10 @@
         <w:pStyle w:val="Date"/>
       </w:pPr>
       <w:r>
-        <w:t xml:space="preserve">Last modified: 2026-10-12 01:05:40 (PDT)</w:t>
-      </w:r>
-    </w:p>
-    <w:bookmarkStart w:id="10" w:name="welcome"/>
+        <w:t xml:space="preserve">Last modified: 2026-10-12 02:31:22 (PDT)</w:t>
+      </w:r>
+    </w:p>
+    <w:bookmarkStart w:id="11" w:name="welcome"/>
     <w:p>
       <w:pPr>
         <w:pStyle w:val="Heading2"/>
@@ -70,13 +70,13 @@
         <w:t xml:space="preserve"> </w:t>
       </w:r>
       <w:r>
-        <w:t xml:space="preserve">They are new, and the topic pages are still to be written.</w:t>
-      </w:r>
-      <w:r>
-        <w:t xml:space="preserve"> </w:t>
-      </w:r>
-      <w:r>
-        <w:t xml:space="preserve">The planned topics are:</w:t>
+        <w:t xml:space="preserve">They are new.</w:t>
+      </w:r>
+      <w:r>
+        <w:t xml:space="preserve"> </w:t>
+      </w:r>
+      <w:r>
+        <w:t xml:space="preserve">The pages written so far are:</w:t>
       </w:r>
     </w:p>
     <w:p>
@@ -87,8 +87,53 @@
           <w:numId w:val="1001"/>
         </w:numPr>
       </w:pPr>
-      <w:r>
-        <w:t xml:space="preserve">models of computation: Turing machines and computability</w:t>
+      <w:hyperlink r:id="rId9">
+        <w:r>
+          <w:rPr>
+            <w:rStyle w:val="Hyperlink"/>
+          </w:rPr>
+          <w:t xml:space="preserve">Asymptotic notation</w:t>
+        </w:r>
+      </w:hyperlink>
+      <w:r>
+        <w:t xml:space="preserve">:</w:t>
+      </w:r>
+      <w:r>
+        <w:t xml:space="preserve"> </w:t>
+      </w:r>
+      <w:r>
+        <w:t xml:space="preserve">big-O, big-Omega and big-Theta, and what it means for a computation to cost</w:t>
+      </w:r>
+      <w:r>
+        <w:t xml:space="preserve"> </w:t>
+      </w:r>
+      <m:oMath>
+        <m:r>
+          <m:t>O</m:t>
+        </m:r>
+        <m:r>
+          <m:rPr>
+            <m:sty m:val="p"/>
+          </m:rPr>
+          <m:t>(</m:t>
+        </m:r>
+        <m:r>
+          <m:t>D</m:t>
+        </m:r>
+        <m:r>
+          <m:rPr>
+            <m:sty m:val="p"/>
+          </m:rPr>
+          <m:t>)</m:t>
+        </m:r>
+      </m:oMath>
+    </w:p>
+    <w:p>
+      <w:pPr>
+        <w:pStyle w:val="FirstParagraph"/>
+      </w:pPr>
+      <w:r>
+        <w:t xml:space="preserve">The planned topics still to come are:</w:t>
       </w:r>
     </w:p>
     <w:p>
@@ -96,11 +141,11 @@
         <w:pStyle w:val="Compact"/>
         <w:numPr>
           <w:ilvl w:val="0"/>
-          <w:numId w:val="1001"/>
+          <w:numId w:val="1002"/>
         </w:numPr>
       </w:pPr>
       <w:r>
-        <w:t xml:space="preserve">time and space complexity, and the classes P and NP</w:t>
+        <w:t xml:space="preserve">models of computation: Turing machines and computability</w:t>
       </w:r>
     </w:p>
     <w:p>
@@ -108,11 +153,11 @@
         <w:pStyle w:val="Compact"/>
         <w:numPr>
           <w:ilvl w:val="0"/>
-          <w:numId w:val="1001"/>
+          <w:numId w:val="1002"/>
         </w:numPr>
       </w:pPr>
       <w:r>
-        <w:t xml:space="preserve">reductions and NP-completeness</w:t>
+        <w:t xml:space="preserve">time and space complexity, and the classes P and NP</w:t>
       </w:r>
     </w:p>
     <w:p>
@@ -120,11 +165,11 @@
         <w:pStyle w:val="Compact"/>
         <w:numPr>
           <w:ilvl w:val="0"/>
-          <w:numId w:val="1001"/>
+          <w:numId w:val="1002"/>
         </w:numPr>
       </w:pPr>
       <w:r>
-        <w:t xml:space="preserve">randomized computation</w:t>
+        <w:t xml:space="preserve">reductions and NP-completeness</w:t>
       </w:r>
     </w:p>
     <w:p>
@@ -132,10 +177,22 @@
         <w:pStyle w:val="Compact"/>
         <w:numPr>
           <w:ilvl w:val="0"/>
-          <w:numId w:val="1001"/>
+          <w:numId w:val="1002"/>
         </w:numPr>
       </w:pPr>
       <w:r>
+        <w:t xml:space="preserve">randomized computation</w:t>
+      </w:r>
+    </w:p>
+    <w:p>
+      <w:pPr>
+        <w:pStyle w:val="Compact"/>
+        <w:numPr>
+          <w:ilvl w:val="0"/>
+          <w:numId w:val="1002"/>
+        </w:numPr>
+      </w:pPr>
+      <w:r>
         <w:t xml:space="preserve">communication and information complexity</w:t>
       </w:r>
     </w:p>
@@ -149,7 +206,7 @@
       <w:r>
         <w:t xml:space="preserve"> </w:t>
       </w:r>
-      <w:hyperlink r:id="rId9">
+      <w:hyperlink r:id="rId10">
         <w:r>
           <w:rPr>
             <w:rStyle w:val="Hyperlink"/>
@@ -175,8 +232,8 @@
         <w:t xml:space="preserve">their main statement, and the other links to them.</w:t>
       </w:r>
     </w:p>
-    <w:bookmarkEnd w:id="10"/>
-    <w:bookmarkStart w:id="15" w:name="starting-materials"/>
+    <w:bookmarkEnd w:id="11"/>
+    <w:bookmarkStart w:id="16" w:name="starting-materials"/>
     <w:p>
       <w:pPr>
         <w:pStyle w:val="Heading2"/>
@@ -198,7 +255,7 @@
         <w:pStyle w:val="Compact"/>
         <w:numPr>
           <w:ilvl w:val="0"/>
-          <w:numId w:val="1002"/>
+          <w:numId w:val="1003"/>
         </w:numPr>
       </w:pPr>
       <w:r>
@@ -229,10 +286,10 @@
         <w:pStyle w:val="Compact"/>
         <w:numPr>
           <w:ilvl w:val="0"/>
-          <w:numId w:val="1002"/>
+          <w:numId w:val="1003"/>
         </w:numPr>
       </w:pPr>
-      <w:hyperlink r:id="rId11">
+      <w:hyperlink r:id="rId12">
         <w:r>
           <w:rPr>
             <w:rStyle w:val="Hyperlink"/>
@@ -277,10 +334,10 @@
         <w:pStyle w:val="Compact"/>
         <w:numPr>
           <w:ilvl w:val="0"/>
-          <w:numId w:val="1002"/>
+          <w:numId w:val="1003"/>
         </w:numPr>
       </w:pPr>
-      <w:hyperlink r:id="rId12">
+      <w:hyperlink r:id="rId13">
         <w:r>
           <w:rPr>
             <w:rStyle w:val="Hyperlink"/>
@@ -306,10 +363,10 @@
         <w:pStyle w:val="Compact"/>
         <w:numPr>
           <w:ilvl w:val="0"/>
-          <w:numId w:val="1002"/>
+          <w:numId w:val="1003"/>
         </w:numPr>
       </w:pPr>
-      <w:hyperlink r:id="rId13">
+      <w:hyperlink r:id="rId14">
         <w:r>
           <w:rPr>
             <w:rStyle w:val="Hyperlink"/>
@@ -340,10 +397,10 @@
         <w:pStyle w:val="Compact"/>
         <w:numPr>
           <w:ilvl w:val="0"/>
-          <w:numId w:val="1002"/>
+          <w:numId w:val="1003"/>
         </w:numPr>
       </w:pPr>
-      <w:hyperlink r:id="rId14">
+      <w:hyperlink r:id="rId15">
         <w:r>
           <w:rPr>
             <w:rStyle w:val="Hyperlink"/>
@@ -389,8 +446,8 @@
         <w:t xml:space="preserve">and links a reading for each lecture.</w:t>
       </w:r>
     </w:p>
-    <w:bookmarkEnd w:id="15"/>
-    <w:bookmarkStart w:id="16" w:name="using-these-notes-in-another-site"/>
+    <w:bookmarkEnd w:id="16"/>
+    <w:bookmarkStart w:id="17" w:name="using-these-notes-in-another-site"/>
     <w:p>
       <w:pPr>
         <w:pStyle w:val="Heading2"/>
@@ -511,7 +568,7 @@
         <w:t xml:space="preserve">uses an explicit link to the page and anchor.</w:t>
       </w:r>
     </w:p>
-    <w:bookmarkEnd w:id="16"/>
+    <w:bookmarkEnd w:id="17"/>
     <w:sectPr>
       <w:footnotePr>
         <w:numRestart w:val="eachSect"/>
@@ -732,6 +789,9 @@
     <w:abstractNumId w:val="991"/>
   </w:num>
   <w:num w:numId="1002">
+    <w:abstractNumId w:val="991"/>
+  </w:num>
+  <w:num w:numId="1003">
     <w:abstractNumId w:val="991"/>
   </w:num>
 </w:numbering>

</xml_diff>

<commit_message>
Deploying to gh-pages from @ Morrison-Lab/cds@26618afe7ed69cc554049f59b552bb7738c3f786 🚀
</commit_message>
<xml_diff>
--- a/index.docx
+++ b/index.docx
@@ -15,10 +15,10 @@
         <w:pStyle w:val="Date"/>
       </w:pPr>
       <w:r>
-        <w:t xml:space="preserve">Last modified: 2026-10-14 01:53:58 (PDT)</w:t>
-      </w:r>
-    </w:p>
-    <w:bookmarkStart w:id="11" w:name="welcome"/>
+        <w:t xml:space="preserve">Last modified: 2026-10-14 11:35:33 (PDT)</w:t>
+      </w:r>
+    </w:p>
+    <w:bookmarkStart w:id="12" w:name="welcome"/>
     <w:p>
       <w:pPr>
         <w:pStyle w:val="Heading2"/>
@@ -130,6 +130,44 @@
     </w:p>
     <w:p>
       <w:pPr>
+        <w:pStyle w:val="Compact"/>
+        <w:numPr>
+          <w:ilvl w:val="0"/>
+          <w:numId w:val="1001"/>
+        </w:numPr>
+      </w:pPr>
+      <w:hyperlink r:id="rId10">
+        <w:r>
+          <w:rPr>
+            <w:rStyle w:val="Hyperlink"/>
+          </w:rPr>
+          <w:t xml:space="preserve">Kolmogorov complexity</w:t>
+        </w:r>
+      </w:hyperlink>
+      <w:r>
+        <w:t xml:space="preserve">:</w:t>
+      </w:r>
+      <w:r>
+        <w:t xml:space="preserve"> </w:t>
+      </w:r>
+      <w:r>
+        <w:t xml:space="preserve">the length of the shortest program that prints a string,</w:t>
+      </w:r>
+      <w:r>
+        <w:t xml:space="preserve"> </w:t>
+      </w:r>
+      <w:r>
+        <w:t xml:space="preserve">why most strings are incompressible and no program computes it,</w:t>
+      </w:r>
+      <w:r>
+        <w:t xml:space="preserve"> </w:t>
+      </w:r>
+      <w:r>
+        <w:t xml:space="preserve">and how its average per symbol approaches Shannon entropy</w:t>
+      </w:r>
+    </w:p>
+    <w:p>
+      <w:pPr>
         <w:pStyle w:val="FirstParagraph"/>
       </w:pPr>
       <w:r>
@@ -206,7 +244,7 @@
       <w:r>
         <w:t xml:space="preserve"> </w:t>
       </w:r>
-      <w:hyperlink r:id="rId10">
+      <w:hyperlink r:id="rId11">
         <w:r>
           <w:rPr>
             <w:rStyle w:val="Hyperlink"/>
@@ -232,8 +270,8 @@
         <w:t xml:space="preserve">their main statement, and the other links to them.</w:t>
       </w:r>
     </w:p>
-    <w:bookmarkEnd w:id="11"/>
-    <w:bookmarkStart w:id="16" w:name="starting-materials"/>
+    <w:bookmarkEnd w:id="12"/>
+    <w:bookmarkStart w:id="17" w:name="starting-materials"/>
     <w:p>
       <w:pPr>
         <w:pStyle w:val="Heading2"/>
@@ -289,7 +327,7 @@
           <w:numId w:val="1003"/>
         </w:numPr>
       </w:pPr>
-      <w:hyperlink r:id="rId12">
+      <w:hyperlink r:id="rId13">
         <w:r>
           <w:rPr>
             <w:rStyle w:val="Hyperlink"/>
@@ -337,7 +375,7 @@
           <w:numId w:val="1003"/>
         </w:numPr>
       </w:pPr>
-      <w:hyperlink r:id="rId13">
+      <w:hyperlink r:id="rId14">
         <w:r>
           <w:rPr>
             <w:rStyle w:val="Hyperlink"/>
@@ -366,7 +404,7 @@
           <w:numId w:val="1003"/>
         </w:numPr>
       </w:pPr>
-      <w:hyperlink r:id="rId14">
+      <w:hyperlink r:id="rId15">
         <w:r>
           <w:rPr>
             <w:rStyle w:val="Hyperlink"/>
@@ -400,7 +438,7 @@
           <w:numId w:val="1003"/>
         </w:numPr>
       </w:pPr>
-      <w:hyperlink r:id="rId15">
+      <w:hyperlink r:id="rId16">
         <w:r>
           <w:rPr>
             <w:rStyle w:val="Hyperlink"/>
@@ -446,8 +484,8 @@
         <w:t xml:space="preserve">and links a reading for each lecture.</w:t>
       </w:r>
     </w:p>
-    <w:bookmarkEnd w:id="16"/>
-    <w:bookmarkStart w:id="17" w:name="using-these-notes-in-another-site"/>
+    <w:bookmarkEnd w:id="17"/>
+    <w:bookmarkStart w:id="18" w:name="using-these-notes-in-another-site"/>
     <w:p>
       <w:pPr>
         <w:pStyle w:val="Heading2"/>
@@ -568,7 +606,7 @@
         <w:t xml:space="preserve">uses an explicit link to the page and anchor.</w:t>
       </w:r>
     </w:p>
-    <w:bookmarkEnd w:id="17"/>
+    <w:bookmarkEnd w:id="18"/>
     <w:sectPr>
       <w:footnotePr>
         <w:numRestart w:val="eachSect"/>

</xml_diff>

<commit_message>
Deploying to gh-pages from @ Morrison-Lab/cds@0e152950ec1a29d02c3a69658817fd9a417bd36b 🚀
</commit_message>
<xml_diff>
--- a/index.docx
+++ b/index.docx
@@ -15,10 +15,10 @@
         <w:pStyle w:val="Date"/>
       </w:pPr>
       <w:r>
-        <w:t xml:space="preserve">Last modified: 2026-10-14 11:35:33 (PDT)</w:t>
-      </w:r>
-    </w:p>
-    <w:bookmarkStart w:id="12" w:name="welcome"/>
+        <w:t xml:space="preserve">Last modified: 2026-10-14 11:47:17 (PDT)</w:t>
+      </w:r>
+    </w:p>
+    <w:bookmarkStart w:id="14" w:name="welcome"/>
     <w:p>
       <w:pPr>
         <w:pStyle w:val="Heading2"/>
@@ -141,6 +141,64 @@
           <w:rPr>
             <w:rStyle w:val="Hyperlink"/>
           </w:rPr>
+          <w:t xml:space="preserve">P and NP</w:t>
+        </w:r>
+      </w:hyperlink>
+      <w:r>
+        <w:t xml:space="preserve">:</w:t>
+      </w:r>
+      <w:r>
+        <w:t xml:space="preserve"> </w:t>
+      </w:r>
+      <w:r>
+        <w:t xml:space="preserve">decision problems, polynomial running time, and the classes P and NP</w:t>
+      </w:r>
+    </w:p>
+    <w:p>
+      <w:pPr>
+        <w:pStyle w:val="Compact"/>
+        <w:numPr>
+          <w:ilvl w:val="0"/>
+          <w:numId w:val="1001"/>
+        </w:numPr>
+      </w:pPr>
+      <w:hyperlink r:id="rId11">
+        <w:r>
+          <w:rPr>
+            <w:rStyle w:val="Hyperlink"/>
+          </w:rPr>
+          <w:t xml:space="preserve">Reductions and NP-completeness</w:t>
+        </w:r>
+      </w:hyperlink>
+      <w:r>
+        <w:t xml:space="preserve">:</w:t>
+      </w:r>
+      <w:r>
+        <w:t xml:space="preserve"> </w:t>
+      </w:r>
+      <w:r>
+        <w:t xml:space="preserve">polynomial-time reductions, NP-complete problems,</w:t>
+      </w:r>
+      <w:r>
+        <w:t xml:space="preserve"> </w:t>
+      </w:r>
+      <w:r>
+        <w:t xml:space="preserve">and why sparse regression is computationally hard</w:t>
+      </w:r>
+    </w:p>
+    <w:p>
+      <w:pPr>
+        <w:pStyle w:val="Compact"/>
+        <w:numPr>
+          <w:ilvl w:val="0"/>
+          <w:numId w:val="1001"/>
+        </w:numPr>
+      </w:pPr>
+      <w:hyperlink r:id="rId12">
+        <w:r>
+          <w:rPr>
+            <w:rStyle w:val="Hyperlink"/>
+          </w:rPr>
           <w:t xml:space="preserve">Kolmogorov complexity</w:t>
         </w:r>
       </w:hyperlink>
@@ -195,7 +253,7 @@
         </w:numPr>
       </w:pPr>
       <w:r>
-        <w:t xml:space="preserve">time and space complexity, and the classes P and NP</w:t>
+        <w:t xml:space="preserve">space complexity</w:t>
       </w:r>
     </w:p>
     <w:p>
@@ -207,7 +265,7 @@
         </w:numPr>
       </w:pPr>
       <w:r>
-        <w:t xml:space="preserve">reductions and NP-completeness</w:t>
+        <w:t xml:space="preserve">randomized computation</w:t>
       </w:r>
     </w:p>
     <w:p>
@@ -219,18 +277,6 @@
         </w:numPr>
       </w:pPr>
       <w:r>
-        <w:t xml:space="preserve">randomized computation</w:t>
-      </w:r>
-    </w:p>
-    <w:p>
-      <w:pPr>
-        <w:pStyle w:val="Compact"/>
-        <w:numPr>
-          <w:ilvl w:val="0"/>
-          <w:numId w:val="1002"/>
-        </w:numPr>
-      </w:pPr>
-      <w:r>
         <w:t xml:space="preserve">communication and information complexity</w:t>
       </w:r>
     </w:p>
@@ -244,7 +290,7 @@
       <w:r>
         <w:t xml:space="preserve"> </w:t>
       </w:r>
-      <w:hyperlink r:id="rId11">
+      <w:hyperlink r:id="rId13">
         <w:r>
           <w:rPr>
             <w:rStyle w:val="Hyperlink"/>
@@ -270,8 +316,8 @@
         <w:t xml:space="preserve">their main statement, and the other links to them.</w:t>
       </w:r>
     </w:p>
-    <w:bookmarkEnd w:id="12"/>
-    <w:bookmarkStart w:id="17" w:name="starting-materials"/>
+    <w:bookmarkEnd w:id="14"/>
+    <w:bookmarkStart w:id="19" w:name="starting-materials"/>
     <w:p>
       <w:pPr>
         <w:pStyle w:val="Heading2"/>
@@ -327,7 +373,7 @@
           <w:numId w:val="1003"/>
         </w:numPr>
       </w:pPr>
-      <w:hyperlink r:id="rId13">
+      <w:hyperlink r:id="rId15">
         <w:r>
           <w:rPr>
             <w:rStyle w:val="Hyperlink"/>
@@ -375,7 +421,7 @@
           <w:numId w:val="1003"/>
         </w:numPr>
       </w:pPr>
-      <w:hyperlink r:id="rId14">
+      <w:hyperlink r:id="rId16">
         <w:r>
           <w:rPr>
             <w:rStyle w:val="Hyperlink"/>
@@ -404,7 +450,7 @@
           <w:numId w:val="1003"/>
         </w:numPr>
       </w:pPr>
-      <w:hyperlink r:id="rId15">
+      <w:hyperlink r:id="rId17">
         <w:r>
           <w:rPr>
             <w:rStyle w:val="Hyperlink"/>
@@ -438,7 +484,7 @@
           <w:numId w:val="1003"/>
         </w:numPr>
       </w:pPr>
-      <w:hyperlink r:id="rId16">
+      <w:hyperlink r:id="rId18">
         <w:r>
           <w:rPr>
             <w:rStyle w:val="Hyperlink"/>
@@ -484,8 +530,8 @@
         <w:t xml:space="preserve">and links a reading for each lecture.</w:t>
       </w:r>
     </w:p>
-    <w:bookmarkEnd w:id="17"/>
-    <w:bookmarkStart w:id="18" w:name="using-these-notes-in-another-site"/>
+    <w:bookmarkEnd w:id="19"/>
+    <w:bookmarkStart w:id="20" w:name="using-these-notes-in-another-site"/>
     <w:p>
       <w:pPr>
         <w:pStyle w:val="Heading2"/>
@@ -606,7 +652,7 @@
         <w:t xml:space="preserve">uses an explicit link to the page and anchor.</w:t>
       </w:r>
     </w:p>
-    <w:bookmarkEnd w:id="18"/>
+    <w:bookmarkEnd w:id="20"/>
     <w:sectPr>
       <w:footnotePr>
         <w:numRestart w:val="eachSect"/>

</xml_diff>